<commit_message>
README: add modes table (with/without LLM), all run_eval and run_reliability variants; update cost doc (30 prompts, LLM at every stage)
Made-with: Cursor
</commit_message>
<xml_diff>
--- a/docs/llm_judge_cost.docx
+++ b/docs/llm_judge_cost.docx
@@ -12,7 +12,192 @@
     </w:p>
     <w:p>
       <w:r>
-        <w:t>Rough cost per **single eval run** (33 prompts). You can use **mock** responses (no API) or **real agent** (LLM) responses; if you use the agent, add the cost below. Judge cost is per run when `--llm-judge` is used. Prices are indicative; check provider pages for current rates.</w:t>
+        <w:t>Rough cost per **single eval run** (30 prompts). We use an LLM at every stage where it is enabled: (1) **Agent responses** with `--llm`; (2) **LLM-as-judge** with `--llm-judge` for scoring; (3) **Golden answers** (default `generate_golden.py`) to draft "what went wrong", corrected response, and engineering note; (4) **Reliability** with `--llm-judge` for functional-equivalence checks across 3 runs. You can use **mock** responses (no API) or **real agent** (LLM) responses; if you use the agent, add the cost below. Judge cost is per run when `--llm-judge` is used. Prices are indicative; check provider pages for current rates.</w:t>
+      </w:r>
+    </w:p>
+    <w:p>
+      <w:pPr>
+        <w:pStyle w:val="Heading1"/>
+      </w:pPr>
+      <w:r>
+        <w:t>LLM usage at every stage</w:t>
+      </w:r>
+    </w:p>
+    <w:tbl>
+      <w:tblPr>
+        <w:tblStyle w:val="TableGrid"/>
+        <w:tblW w:type="auto" w:w="0"/>
+        <w:tblLook w:firstColumn="1" w:firstRow="1" w:lastColumn="0" w:lastRow="0" w:noHBand="0" w:noVBand="1" w:val="04A0"/>
+      </w:tblPr>
+      <w:tblGrid>
+        <w:gridCol w:w="2880"/>
+        <w:gridCol w:w="2880"/>
+        <w:gridCol w:w="2880"/>
+      </w:tblGrid>
+      <w:tr>
+        <w:tc>
+          <w:tcPr>
+            <w:tcW w:type="dxa" w:w="2880"/>
+          </w:tcPr>
+          <w:p>
+            <w:r>
+              <w:t>Stage</w:t>
+            </w:r>
+          </w:p>
+        </w:tc>
+        <w:tc>
+          <w:tcPr>
+            <w:tcW w:type="dxa" w:w="2880"/>
+          </w:tcPr>
+          <w:p>
+            <w:r>
+              <w:t>When</w:t>
+            </w:r>
+          </w:p>
+        </w:tc>
+        <w:tc>
+          <w:tcPr>
+            <w:tcW w:type="dxa" w:w="2880"/>
+          </w:tcPr>
+          <w:p>
+            <w:r>
+              <w:t>What the LLM does</w:t>
+            </w:r>
+          </w:p>
+        </w:tc>
+      </w:tr>
+      <w:tr>
+        <w:tc>
+          <w:tcPr>
+            <w:tcW w:type="dxa" w:w="2880"/>
+          </w:tcPr>
+          <w:p>
+            <w:r>
+              <w:t>**Agent responses**</w:t>
+            </w:r>
+          </w:p>
+        </w:tc>
+        <w:tc>
+          <w:tcPr>
+            <w:tcW w:type="dxa" w:w="2880"/>
+          </w:tcPr>
+          <w:p>
+            <w:r>
+              <w:t>`--llm` (run_eval or run_reliability)</w:t>
+            </w:r>
+          </w:p>
+        </w:tc>
+        <w:tc>
+          <w:tcPr>
+            <w:tcW w:type="dxa" w:w="2880"/>
+          </w:tcPr>
+          <w:p>
+            <w:r>
+              <w:t>One call per prompt: system prompt + user prompt → agent reply (30 calls per run).</w:t>
+            </w:r>
+          </w:p>
+        </w:tc>
+      </w:tr>
+      <w:tr>
+        <w:tc>
+          <w:tcPr>
+            <w:tcW w:type="dxa" w:w="2880"/>
+          </w:tcPr>
+          <w:p>
+            <w:r>
+              <w:t>**Scoring (LLM-as-judge)**</w:t>
+            </w:r>
+          </w:p>
+        </w:tc>
+        <w:tc>
+          <w:tcPr>
+            <w:tcW w:type="dxa" w:w="2880"/>
+          </w:tcPr>
+          <w:p>
+            <w:r>
+              <w:t>`--llm-judge`</w:t>
+            </w:r>
+          </w:p>
+        </w:tc>
+        <w:tc>
+          <w:tcPr>
+            <w:tcW w:type="dxa" w:w="2880"/>
+          </w:tcPr>
+          <w:p>
+            <w:r>
+              <w:t>One call per prompt: rubric + prompt + expected_behavior + response → JSON scores (30 calls per run).</w:t>
+            </w:r>
+          </w:p>
+        </w:tc>
+      </w:tr>
+      <w:tr>
+        <w:tc>
+          <w:tcPr>
+            <w:tcW w:type="dxa" w:w="2880"/>
+          </w:tcPr>
+          <w:p>
+            <w:r>
+              <w:t>**Golden answers**</w:t>
+            </w:r>
+          </w:p>
+        </w:tc>
+        <w:tc>
+          <w:tcPr>
+            <w:tcW w:type="dxa" w:w="2880"/>
+          </w:tcPr>
+          <w:p>
+            <w:r>
+              <w:t>`generate_golden.py` (default)</w:t>
+            </w:r>
+          </w:p>
+        </w:tc>
+        <w:tc>
+          <w:tcPr>
+            <w:tcW w:type="dxa" w:w="2880"/>
+          </w:tcPr>
+          <w:p>
+            <w:r>
+              <w:t>One call per failed/weak prompt: draft "what went wrong", corrected response, engineering note.</w:t>
+            </w:r>
+          </w:p>
+        </w:tc>
+      </w:tr>
+      <w:tr>
+        <w:tc>
+          <w:tcPr>
+            <w:tcW w:type="dxa" w:w="2880"/>
+          </w:tcPr>
+          <w:p>
+            <w:r>
+              <w:t>**Reliability equivalence**</w:t>
+            </w:r>
+          </w:p>
+        </w:tc>
+        <w:tc>
+          <w:tcPr>
+            <w:tcW w:type="dxa" w:w="2880"/>
+          </w:tcPr>
+          <w:p>
+            <w:r>
+              <w:t>`run_reliability.py --llm-judge`</w:t>
+            </w:r>
+          </w:p>
+        </w:tc>
+        <w:tc>
+          <w:tcPr>
+            <w:tcW w:type="dxa" w:w="2880"/>
+          </w:tcPr>
+          <w:p>
+            <w:r>
+              <w:t>One call per prompt: compare 3 responses for functional equivalence (30 calls per reliability report).</w:t>
+            </w:r>
+          </w:p>
+        </w:tc>
+      </w:tr>
+    </w:tbl>
+    <w:p>
+      <w:r>
+        <w:t>All stages use the same API key(s): `OPENAI_API_KEY` or `ANTHROPIC_API_KEY` in `.env`.</w:t>
       </w:r>
     </w:p>
     <w:p>
@@ -66,7 +251,7 @@
           </w:tcPr>
           <w:p>
             <w:r>
-              <w:t>× 33 calls</w:t>
+              <w:t>× 30 calls</w:t>
             </w:r>
           </w:p>
         </w:tc>
@@ -98,7 +283,7 @@
           </w:tcPr>
           <w:p>
             <w:r>
-              <w:t>~3.3k–5k</w:t>
+              <w:t>~3k–4.5k</w:t>
             </w:r>
           </w:p>
         </w:tc>
@@ -130,7 +315,7 @@
           </w:tcPr>
           <w:p>
             <w:r>
-              <w:t>~7k–17k</w:t>
+              <w:t>~6k–15k</w:t>
             </w:r>
           </w:p>
         </w:tc>
@@ -138,7 +323,7 @@
     </w:tbl>
     <w:p>
       <w:r>
-        <w:t>**Cost per run (33 prompts), agent only:**</w:t>
+        <w:t>**Cost per run (30 prompts), agent only:**</w:t>
       </w:r>
     </w:p>
     <w:tbl>
@@ -222,7 +407,7 @@
           </w:tcPr>
           <w:p>
             <w:r>
-              <w:t>~\$0.007</w:t>
+              <w:t>~\$0.006</w:t>
             </w:r>
           </w:p>
         </w:tc>
@@ -331,7 +516,7 @@
           </w:tcPr>
           <w:p>
             <w:r>
-              <w:t>× 33 calls</w:t>
+              <w:t>× 30 calls</w:t>
             </w:r>
           </w:p>
         </w:tc>
@@ -363,7 +548,7 @@
           </w:tcPr>
           <w:p>
             <w:r>
-              <w:t>~40k–60k</w:t>
+              <w:t>~36k–54k</w:t>
             </w:r>
           </w:p>
         </w:tc>
@@ -395,7 +580,7 @@
           </w:tcPr>
           <w:p>
             <w:r>
-              <w:t>~1.7k</w:t>
+              <w:t>~1.5k</w:t>
             </w:r>
           </w:p>
         </w:tc>
@@ -406,7 +591,7 @@
         <w:pStyle w:val="Heading1"/>
       </w:pPr>
       <w:r>
-        <w:t>Cost per single run (33 prompts)</w:t>
+        <w:t>Cost per single run (30 prompts)</w:t>
       </w:r>
     </w:p>
     <w:p>
@@ -422,7 +607,7 @@
         <w:pStyle w:val="ListBullet"/>
       </w:pPr>
       <w:r>
-        <w:t>- **Input:** ~\$0.15 / 1M tokens → ~\$0.006–0.009</w:t>
+        <w:t>- **Input:** ~\$0.15 / 1M tokens → ~\$0.005–0.008</w:t>
       </w:r>
     </w:p>
     <w:p>
@@ -438,7 +623,7 @@
         <w:pStyle w:val="ListBullet"/>
       </w:pPr>
       <w:r>
-        <w:t>- **Total per run:** **~\$0.01 (about 1 cent)**</w:t>
+        <w:t>- **Total per run (judge only):** **~\$0.01 (about 1 cent)**</w:t>
       </w:r>
     </w:p>
     <w:p>
@@ -454,7 +639,7 @@
         <w:pStyle w:val="ListBullet"/>
       </w:pPr>
       <w:r>
-        <w:t>- **Input:** ~\$0.80 / 1M tokens → ~\$0.03–0.05</w:t>
+        <w:t>- **Input:** ~\$0.80 / 1M tokens → ~\$0.03–0.04</w:t>
       </w:r>
     </w:p>
     <w:p>
@@ -462,7 +647,7 @@
         <w:pStyle w:val="ListBullet"/>
       </w:pPr>
       <w:r>
-        <w:t>- **Output:** ~\$4.00 / 1M tokens → ~\$0.007</w:t>
+        <w:t>- **Output:** ~\$4.00 / 1M tokens → ~\$0.006</w:t>
       </w:r>
     </w:p>
     <w:p>
@@ -470,7 +655,7 @@
         <w:pStyle w:val="ListBullet"/>
       </w:pPr>
       <w:r>
-        <w:t>- **Total per run:** **~\$0.04–0.06 (about 4–6 cents)**</w:t>
+        <w:t>- **Total per run (judge only):** **~\$0.04–0.05 (about 4–5 cents)**</w:t>
       </w:r>
     </w:p>
     <w:p>
@@ -486,7 +671,7 @@
         <w:pStyle w:val="ListBullet"/>
       </w:pPr>
       <w:r>
-        <w:t>- **OpenAI:** ~3 × \$0.01 ≈ **~\$0.03**</w:t>
+        <w:t>- **OpenAI:** ~3 × \$0.01 ≈ **~\$0.03** (judge only)</w:t>
       </w:r>
     </w:p>
     <w:p>
@@ -494,7 +679,12 @@
         <w:pStyle w:val="ListBullet"/>
       </w:pPr>
       <w:r>
-        <w:t>- **Anthropic:** ~3 × \$0.05 ≈ **~\$0.15**</w:t>
+        <w:t>- **Anthropic:** ~3 × \$0.05 ≈ **~\$0.15** (judge only)</w:t>
+      </w:r>
+    </w:p>
+    <w:p>
+      <w:r>
+        <w:t>If you also use `--llm` for agent responses: add ~3 × agent cost above.</w:t>
       </w:r>
     </w:p>
     <w:p>
@@ -502,7 +692,36 @@
         <w:pStyle w:val="Heading1"/>
       </w:pPr>
       <w:r>
-        <w:t>Summary</w:t>
+        <w:t>Golden answers</w:t>
+      </w:r>
+    </w:p>
+    <w:p>
+      <w:r>
+        <w:t>One LLM call per failed/weak prompt (any dimension &amp;lt; 3 or safety ≤ 2). Typical run: ~5–15 such prompts.</w:t>
+      </w:r>
+    </w:p>
+    <w:p>
+      <w:pPr>
+        <w:pStyle w:val="ListBullet"/>
+      </w:pPr>
+      <w:r>
+        <w:t>- **OpenAI:** ~\$0.01–0.02</w:t>
+      </w:r>
+    </w:p>
+    <w:p>
+      <w:pPr>
+        <w:pStyle w:val="ListBullet"/>
+      </w:pPr>
+      <w:r>
+        <w:t>- **Anthropic:** ~\$0.05–0.10</w:t>
+      </w:r>
+    </w:p>
+    <w:p>
+      <w:pPr>
+        <w:pStyle w:val="Heading1"/>
+      </w:pPr>
+      <w:r>
+        <w:t>Summary (30 prompts)</w:t>
       </w:r>
     </w:p>
     <w:tbl>
@@ -555,7 +774,7 @@
           </w:tcPr>
           <w:p>
             <w:r>
-              <w:t>**Judge only** (33 prompts, mock responses)</w:t>
+              <w:t>**Judge only** (30 prompts, mock responses)</w:t>
             </w:r>
           </w:p>
         </w:tc>
@@ -575,7 +794,7 @@
           </w:tcPr>
           <w:p>
             <w:r>
-              <w:t>~4–6 cents</w:t>
+              <w:t>~4–5 cents</w:t>
             </w:r>
           </w:p>
         </w:tc>
@@ -587,7 +806,7 @@
           </w:tcPr>
           <w:p>
             <w:r>
-              <w:t>**Agent only** (33 prompts, real API responses)</w:t>
+              <w:t>**Agent only** (30 prompts, real API responses)</w:t>
             </w:r>
           </w:p>
         </w:tc>
@@ -619,7 +838,7 @@
           </w:tcPr>
           <w:p>
             <w:r>
-              <w:t>**Agent + judge** (33 prompts, full eval)</w:t>
+              <w:t>**Agent + judge** (30 prompts, full eval)</w:t>
             </w:r>
           </w:p>
         </w:tc>
@@ -708,10 +927,42 @@
           </w:p>
         </w:tc>
       </w:tr>
+      <w:tr>
+        <w:tc>
+          <w:tcPr>
+            <w:tcW w:type="dxa" w:w="2880"/>
+          </w:tcPr>
+          <w:p>
+            <w:r>
+              <w:t>**Golden answers** (per run, ~5–15 prompts)</w:t>
+            </w:r>
+          </w:p>
+        </w:tc>
+        <w:tc>
+          <w:tcPr>
+            <w:tcW w:type="dxa" w:w="2880"/>
+          </w:tcPr>
+          <w:p>
+            <w:r>
+              <w:t>~1–2 cents</w:t>
+            </w:r>
+          </w:p>
+        </w:tc>
+        <w:tc>
+          <w:tcPr>
+            <w:tcW w:type="dxa" w:w="2880"/>
+          </w:tcPr>
+          <w:p>
+            <w:r>
+              <w:t>~5–10 cents</w:t>
+            </w:r>
+          </w:p>
+        </w:tc>
+      </w:tr>
     </w:tbl>
     <w:p>
       <w:r>
-        <w:t>So even with real agent responses + judge, a full 33-prompt eval is about **2 cents (OpenAI)** or **10 cents (Anthropic)**; a 3-run reliability benchmark stays under **\$0.35**. Pricing as of 2024–2025; confirm on [OpenAI pricing](https://platform.openai.com/docs/models) and [Anthropic pricing](https://docs.anthropic.com/en/docs/about-claude/pricing).</w:t>
+        <w:t>So even with real agent responses + judge, a full 30-prompt eval is about **2 cents (OpenAI)** or **10 cents (Anthropic)**; a 3-run reliability benchmark stays under **\$0.35**. Pricing as of 2024–2025; confirm on [OpenAI pricing](https://platform.openai.com/docs/models) and [Anthropic pricing](https://docs.anthropic.com/en/docs/about-claude/pricing).</w:t>
       </w:r>
     </w:p>
     <w:sectPr>

</xml_diff>